<commit_message>
Thirty-three students, and no row looks like its neighbour
The roster, the teacher's grid and the workbook grow from 20 to 33 seats.
The Part B grid gains taller rows and alternate shading so a score written
at speed cannot land one row off - the failure a page of identical rows
invites. The header row repeats when the grid crosses onto a second page.
Student Packet regenerated byte-identical; restored rather than recommitted.

Co-Authored-By: Claude Fable 5 <noreply@anthropic.com>
</commit_message>
<xml_diff>
--- a/Assessment/Print Ready - Aug 2026/Helper Sheet.docx
+++ b/Assessment/Print Ready - Aug 2026/Helper Sheet.docx
@@ -1730,7 +1730,7 @@
           <w:sz w:val="19"/>
           <w:szCs w:val="19"/>
         </w:rPr>
-        <w:t xml:space="preserve">An ID belongs to its student for good — if M‑03 leaves the programme, the next child is M‑16, never M‑03 again. Next assessment, same IDs.</w:t>
+        <w:t xml:space="preserve">An ID belongs to its student for good — if M‑03 leaves the programme, the next child is M‑34, never M‑03 again. Next assessment, same IDs.</w:t>
       </w:r>
     </w:p>
     <w:tbl>
@@ -3097,6 +3097,1101 @@
                 <w:szCs w:val="22"/>
               </w:rPr>
               <w:t xml:space="preserve">M – 18</w:t>
+            </w:r>
+          </w:p>
+        </w:tc>
+        <w:tc>
+          <w:tcPr>
+            <w:tcW w:type="dxa" w:w="5400"/>
+            <w:tcMar>
+              <w:top w:type="dxa" w:w="60"/>
+              <w:left w:type="dxa" w:w="110"/>
+              <w:bottom w:type="dxa" w:w="60"/>
+              <w:right w:type="dxa" w:w="110"/>
+            </w:tcMar>
+          </w:tcPr>
+          <w:p>
+            <w:pPr>
+              <w:spacing w:after="90"/>
+            </w:pPr>
+            <w:r>
+              <w:rPr>
+                <w:sz w:val="22"/>
+                <w:szCs w:val="22"/>
+              </w:rPr>
+              <w:t xml:space="preserve"> </w:t>
+            </w:r>
+          </w:p>
+        </w:tc>
+        <w:tc>
+          <w:tcPr>
+            <w:tcW w:type="dxa" w:w="3200"/>
+            <w:tcMar>
+              <w:top w:type="dxa" w:w="60"/>
+              <w:left w:type="dxa" w:w="110"/>
+              <w:bottom w:type="dxa" w:w="60"/>
+              <w:right w:type="dxa" w:w="110"/>
+            </w:tcMar>
+          </w:tcPr>
+          <w:p>
+            <w:pPr>
+              <w:spacing w:after="90"/>
+            </w:pPr>
+            <w:r>
+              <w:rPr>
+                <w:sz w:val="22"/>
+                <w:szCs w:val="22"/>
+              </w:rPr>
+              <w:t xml:space="preserve"> </w:t>
+            </w:r>
+          </w:p>
+        </w:tc>
+      </w:tr>
+      <w:tr>
+        <w:tc>
+          <w:tcPr>
+            <w:tcW w:type="dxa" w:w="1600"/>
+            <w:tcMar>
+              <w:top w:type="dxa" w:w="60"/>
+              <w:left w:type="dxa" w:w="110"/>
+              <w:bottom w:type="dxa" w:w="60"/>
+              <w:right w:type="dxa" w:w="110"/>
+            </w:tcMar>
+          </w:tcPr>
+          <w:p>
+            <w:pPr>
+              <w:spacing w:after="60" w:before="60"/>
+            </w:pPr>
+            <w:r>
+              <w:rPr>
+                <w:b/>
+                <w:bCs/>
+                <w:sz w:val="22"/>
+                <w:szCs w:val="22"/>
+              </w:rPr>
+              <w:t xml:space="preserve">M – 19</w:t>
+            </w:r>
+          </w:p>
+        </w:tc>
+        <w:tc>
+          <w:tcPr>
+            <w:tcW w:type="dxa" w:w="5400"/>
+            <w:tcMar>
+              <w:top w:type="dxa" w:w="60"/>
+              <w:left w:type="dxa" w:w="110"/>
+              <w:bottom w:type="dxa" w:w="60"/>
+              <w:right w:type="dxa" w:w="110"/>
+            </w:tcMar>
+          </w:tcPr>
+          <w:p>
+            <w:pPr>
+              <w:spacing w:after="90"/>
+            </w:pPr>
+            <w:r>
+              <w:rPr>
+                <w:sz w:val="22"/>
+                <w:szCs w:val="22"/>
+              </w:rPr>
+              <w:t xml:space="preserve"> </w:t>
+            </w:r>
+          </w:p>
+        </w:tc>
+        <w:tc>
+          <w:tcPr>
+            <w:tcW w:type="dxa" w:w="3200"/>
+            <w:tcMar>
+              <w:top w:type="dxa" w:w="60"/>
+              <w:left w:type="dxa" w:w="110"/>
+              <w:bottom w:type="dxa" w:w="60"/>
+              <w:right w:type="dxa" w:w="110"/>
+            </w:tcMar>
+          </w:tcPr>
+          <w:p>
+            <w:pPr>
+              <w:spacing w:after="90"/>
+            </w:pPr>
+            <w:r>
+              <w:rPr>
+                <w:sz w:val="22"/>
+                <w:szCs w:val="22"/>
+              </w:rPr>
+              <w:t xml:space="preserve"> </w:t>
+            </w:r>
+          </w:p>
+        </w:tc>
+      </w:tr>
+      <w:tr>
+        <w:tc>
+          <w:tcPr>
+            <w:tcW w:type="dxa" w:w="1600"/>
+            <w:tcMar>
+              <w:top w:type="dxa" w:w="60"/>
+              <w:left w:type="dxa" w:w="110"/>
+              <w:bottom w:type="dxa" w:w="60"/>
+              <w:right w:type="dxa" w:w="110"/>
+            </w:tcMar>
+          </w:tcPr>
+          <w:p>
+            <w:pPr>
+              <w:spacing w:after="60" w:before="60"/>
+            </w:pPr>
+            <w:r>
+              <w:rPr>
+                <w:b/>
+                <w:bCs/>
+                <w:sz w:val="22"/>
+                <w:szCs w:val="22"/>
+              </w:rPr>
+              <w:t xml:space="preserve">M – 20</w:t>
+            </w:r>
+          </w:p>
+        </w:tc>
+        <w:tc>
+          <w:tcPr>
+            <w:tcW w:type="dxa" w:w="5400"/>
+            <w:tcMar>
+              <w:top w:type="dxa" w:w="60"/>
+              <w:left w:type="dxa" w:w="110"/>
+              <w:bottom w:type="dxa" w:w="60"/>
+              <w:right w:type="dxa" w:w="110"/>
+            </w:tcMar>
+          </w:tcPr>
+          <w:p>
+            <w:pPr>
+              <w:spacing w:after="90"/>
+            </w:pPr>
+            <w:r>
+              <w:rPr>
+                <w:sz w:val="22"/>
+                <w:szCs w:val="22"/>
+              </w:rPr>
+              <w:t xml:space="preserve"> </w:t>
+            </w:r>
+          </w:p>
+        </w:tc>
+        <w:tc>
+          <w:tcPr>
+            <w:tcW w:type="dxa" w:w="3200"/>
+            <w:tcMar>
+              <w:top w:type="dxa" w:w="60"/>
+              <w:left w:type="dxa" w:w="110"/>
+              <w:bottom w:type="dxa" w:w="60"/>
+              <w:right w:type="dxa" w:w="110"/>
+            </w:tcMar>
+          </w:tcPr>
+          <w:p>
+            <w:pPr>
+              <w:spacing w:after="90"/>
+            </w:pPr>
+            <w:r>
+              <w:rPr>
+                <w:sz w:val="22"/>
+                <w:szCs w:val="22"/>
+              </w:rPr>
+              <w:t xml:space="preserve"> </w:t>
+            </w:r>
+          </w:p>
+        </w:tc>
+      </w:tr>
+      <w:tr>
+        <w:tc>
+          <w:tcPr>
+            <w:tcW w:type="dxa" w:w="1600"/>
+            <w:tcMar>
+              <w:top w:type="dxa" w:w="60"/>
+              <w:left w:type="dxa" w:w="110"/>
+              <w:bottom w:type="dxa" w:w="60"/>
+              <w:right w:type="dxa" w:w="110"/>
+            </w:tcMar>
+          </w:tcPr>
+          <w:p>
+            <w:pPr>
+              <w:spacing w:after="60" w:before="60"/>
+            </w:pPr>
+            <w:r>
+              <w:rPr>
+                <w:b/>
+                <w:bCs/>
+                <w:sz w:val="22"/>
+                <w:szCs w:val="22"/>
+              </w:rPr>
+              <w:t xml:space="preserve">M – 21</w:t>
+            </w:r>
+          </w:p>
+        </w:tc>
+        <w:tc>
+          <w:tcPr>
+            <w:tcW w:type="dxa" w:w="5400"/>
+            <w:tcMar>
+              <w:top w:type="dxa" w:w="60"/>
+              <w:left w:type="dxa" w:w="110"/>
+              <w:bottom w:type="dxa" w:w="60"/>
+              <w:right w:type="dxa" w:w="110"/>
+            </w:tcMar>
+          </w:tcPr>
+          <w:p>
+            <w:pPr>
+              <w:spacing w:after="90"/>
+            </w:pPr>
+            <w:r>
+              <w:rPr>
+                <w:sz w:val="22"/>
+                <w:szCs w:val="22"/>
+              </w:rPr>
+              <w:t xml:space="preserve"> </w:t>
+            </w:r>
+          </w:p>
+        </w:tc>
+        <w:tc>
+          <w:tcPr>
+            <w:tcW w:type="dxa" w:w="3200"/>
+            <w:tcMar>
+              <w:top w:type="dxa" w:w="60"/>
+              <w:left w:type="dxa" w:w="110"/>
+              <w:bottom w:type="dxa" w:w="60"/>
+              <w:right w:type="dxa" w:w="110"/>
+            </w:tcMar>
+          </w:tcPr>
+          <w:p>
+            <w:pPr>
+              <w:spacing w:after="90"/>
+            </w:pPr>
+            <w:r>
+              <w:rPr>
+                <w:sz w:val="22"/>
+                <w:szCs w:val="22"/>
+              </w:rPr>
+              <w:t xml:space="preserve"> </w:t>
+            </w:r>
+          </w:p>
+        </w:tc>
+      </w:tr>
+      <w:tr>
+        <w:tc>
+          <w:tcPr>
+            <w:tcW w:type="dxa" w:w="1600"/>
+            <w:tcMar>
+              <w:top w:type="dxa" w:w="60"/>
+              <w:left w:type="dxa" w:w="110"/>
+              <w:bottom w:type="dxa" w:w="60"/>
+              <w:right w:type="dxa" w:w="110"/>
+            </w:tcMar>
+          </w:tcPr>
+          <w:p>
+            <w:pPr>
+              <w:spacing w:after="60" w:before="60"/>
+            </w:pPr>
+            <w:r>
+              <w:rPr>
+                <w:b/>
+                <w:bCs/>
+                <w:sz w:val="22"/>
+                <w:szCs w:val="22"/>
+              </w:rPr>
+              <w:t xml:space="preserve">M – 22</w:t>
+            </w:r>
+          </w:p>
+        </w:tc>
+        <w:tc>
+          <w:tcPr>
+            <w:tcW w:type="dxa" w:w="5400"/>
+            <w:tcMar>
+              <w:top w:type="dxa" w:w="60"/>
+              <w:left w:type="dxa" w:w="110"/>
+              <w:bottom w:type="dxa" w:w="60"/>
+              <w:right w:type="dxa" w:w="110"/>
+            </w:tcMar>
+          </w:tcPr>
+          <w:p>
+            <w:pPr>
+              <w:spacing w:after="90"/>
+            </w:pPr>
+            <w:r>
+              <w:rPr>
+                <w:sz w:val="22"/>
+                <w:szCs w:val="22"/>
+              </w:rPr>
+              <w:t xml:space="preserve"> </w:t>
+            </w:r>
+          </w:p>
+        </w:tc>
+        <w:tc>
+          <w:tcPr>
+            <w:tcW w:type="dxa" w:w="3200"/>
+            <w:tcMar>
+              <w:top w:type="dxa" w:w="60"/>
+              <w:left w:type="dxa" w:w="110"/>
+              <w:bottom w:type="dxa" w:w="60"/>
+              <w:right w:type="dxa" w:w="110"/>
+            </w:tcMar>
+          </w:tcPr>
+          <w:p>
+            <w:pPr>
+              <w:spacing w:after="90"/>
+            </w:pPr>
+            <w:r>
+              <w:rPr>
+                <w:sz w:val="22"/>
+                <w:szCs w:val="22"/>
+              </w:rPr>
+              <w:t xml:space="preserve"> </w:t>
+            </w:r>
+          </w:p>
+        </w:tc>
+      </w:tr>
+      <w:tr>
+        <w:tc>
+          <w:tcPr>
+            <w:tcW w:type="dxa" w:w="1600"/>
+            <w:tcMar>
+              <w:top w:type="dxa" w:w="60"/>
+              <w:left w:type="dxa" w:w="110"/>
+              <w:bottom w:type="dxa" w:w="60"/>
+              <w:right w:type="dxa" w:w="110"/>
+            </w:tcMar>
+          </w:tcPr>
+          <w:p>
+            <w:pPr>
+              <w:spacing w:after="60" w:before="60"/>
+            </w:pPr>
+            <w:r>
+              <w:rPr>
+                <w:b/>
+                <w:bCs/>
+                <w:sz w:val="22"/>
+                <w:szCs w:val="22"/>
+              </w:rPr>
+              <w:t xml:space="preserve">M – 23</w:t>
+            </w:r>
+          </w:p>
+        </w:tc>
+        <w:tc>
+          <w:tcPr>
+            <w:tcW w:type="dxa" w:w="5400"/>
+            <w:tcMar>
+              <w:top w:type="dxa" w:w="60"/>
+              <w:left w:type="dxa" w:w="110"/>
+              <w:bottom w:type="dxa" w:w="60"/>
+              <w:right w:type="dxa" w:w="110"/>
+            </w:tcMar>
+          </w:tcPr>
+          <w:p>
+            <w:pPr>
+              <w:spacing w:after="90"/>
+            </w:pPr>
+            <w:r>
+              <w:rPr>
+                <w:sz w:val="22"/>
+                <w:szCs w:val="22"/>
+              </w:rPr>
+              <w:t xml:space="preserve"> </w:t>
+            </w:r>
+          </w:p>
+        </w:tc>
+        <w:tc>
+          <w:tcPr>
+            <w:tcW w:type="dxa" w:w="3200"/>
+            <w:tcMar>
+              <w:top w:type="dxa" w:w="60"/>
+              <w:left w:type="dxa" w:w="110"/>
+              <w:bottom w:type="dxa" w:w="60"/>
+              <w:right w:type="dxa" w:w="110"/>
+            </w:tcMar>
+          </w:tcPr>
+          <w:p>
+            <w:pPr>
+              <w:spacing w:after="90"/>
+            </w:pPr>
+            <w:r>
+              <w:rPr>
+                <w:sz w:val="22"/>
+                <w:szCs w:val="22"/>
+              </w:rPr>
+              <w:t xml:space="preserve"> </w:t>
+            </w:r>
+          </w:p>
+        </w:tc>
+      </w:tr>
+      <w:tr>
+        <w:tc>
+          <w:tcPr>
+            <w:tcW w:type="dxa" w:w="1600"/>
+            <w:tcMar>
+              <w:top w:type="dxa" w:w="60"/>
+              <w:left w:type="dxa" w:w="110"/>
+              <w:bottom w:type="dxa" w:w="60"/>
+              <w:right w:type="dxa" w:w="110"/>
+            </w:tcMar>
+          </w:tcPr>
+          <w:p>
+            <w:pPr>
+              <w:spacing w:after="60" w:before="60"/>
+            </w:pPr>
+            <w:r>
+              <w:rPr>
+                <w:b/>
+                <w:bCs/>
+                <w:sz w:val="22"/>
+                <w:szCs w:val="22"/>
+              </w:rPr>
+              <w:t xml:space="preserve">M – 24</w:t>
+            </w:r>
+          </w:p>
+        </w:tc>
+        <w:tc>
+          <w:tcPr>
+            <w:tcW w:type="dxa" w:w="5400"/>
+            <w:tcMar>
+              <w:top w:type="dxa" w:w="60"/>
+              <w:left w:type="dxa" w:w="110"/>
+              <w:bottom w:type="dxa" w:w="60"/>
+              <w:right w:type="dxa" w:w="110"/>
+            </w:tcMar>
+          </w:tcPr>
+          <w:p>
+            <w:pPr>
+              <w:spacing w:after="90"/>
+            </w:pPr>
+            <w:r>
+              <w:rPr>
+                <w:sz w:val="22"/>
+                <w:szCs w:val="22"/>
+              </w:rPr>
+              <w:t xml:space="preserve"> </w:t>
+            </w:r>
+          </w:p>
+        </w:tc>
+        <w:tc>
+          <w:tcPr>
+            <w:tcW w:type="dxa" w:w="3200"/>
+            <w:tcMar>
+              <w:top w:type="dxa" w:w="60"/>
+              <w:left w:type="dxa" w:w="110"/>
+              <w:bottom w:type="dxa" w:w="60"/>
+              <w:right w:type="dxa" w:w="110"/>
+            </w:tcMar>
+          </w:tcPr>
+          <w:p>
+            <w:pPr>
+              <w:spacing w:after="90"/>
+            </w:pPr>
+            <w:r>
+              <w:rPr>
+                <w:sz w:val="22"/>
+                <w:szCs w:val="22"/>
+              </w:rPr>
+              <w:t xml:space="preserve"> </w:t>
+            </w:r>
+          </w:p>
+        </w:tc>
+      </w:tr>
+      <w:tr>
+        <w:tc>
+          <w:tcPr>
+            <w:tcW w:type="dxa" w:w="1600"/>
+            <w:tcMar>
+              <w:top w:type="dxa" w:w="60"/>
+              <w:left w:type="dxa" w:w="110"/>
+              <w:bottom w:type="dxa" w:w="60"/>
+              <w:right w:type="dxa" w:w="110"/>
+            </w:tcMar>
+          </w:tcPr>
+          <w:p>
+            <w:pPr>
+              <w:spacing w:after="60" w:before="60"/>
+            </w:pPr>
+            <w:r>
+              <w:rPr>
+                <w:b/>
+                <w:bCs/>
+                <w:sz w:val="22"/>
+                <w:szCs w:val="22"/>
+              </w:rPr>
+              <w:t xml:space="preserve">M – 25</w:t>
+            </w:r>
+          </w:p>
+        </w:tc>
+        <w:tc>
+          <w:tcPr>
+            <w:tcW w:type="dxa" w:w="5400"/>
+            <w:tcMar>
+              <w:top w:type="dxa" w:w="60"/>
+              <w:left w:type="dxa" w:w="110"/>
+              <w:bottom w:type="dxa" w:w="60"/>
+              <w:right w:type="dxa" w:w="110"/>
+            </w:tcMar>
+          </w:tcPr>
+          <w:p>
+            <w:pPr>
+              <w:spacing w:after="90"/>
+            </w:pPr>
+            <w:r>
+              <w:rPr>
+                <w:sz w:val="22"/>
+                <w:szCs w:val="22"/>
+              </w:rPr>
+              <w:t xml:space="preserve"> </w:t>
+            </w:r>
+          </w:p>
+        </w:tc>
+        <w:tc>
+          <w:tcPr>
+            <w:tcW w:type="dxa" w:w="3200"/>
+            <w:tcMar>
+              <w:top w:type="dxa" w:w="60"/>
+              <w:left w:type="dxa" w:w="110"/>
+              <w:bottom w:type="dxa" w:w="60"/>
+              <w:right w:type="dxa" w:w="110"/>
+            </w:tcMar>
+          </w:tcPr>
+          <w:p>
+            <w:pPr>
+              <w:spacing w:after="90"/>
+            </w:pPr>
+            <w:r>
+              <w:rPr>
+                <w:sz w:val="22"/>
+                <w:szCs w:val="22"/>
+              </w:rPr>
+              <w:t xml:space="preserve"> </w:t>
+            </w:r>
+          </w:p>
+        </w:tc>
+      </w:tr>
+      <w:tr>
+        <w:tc>
+          <w:tcPr>
+            <w:tcW w:type="dxa" w:w="1600"/>
+            <w:tcMar>
+              <w:top w:type="dxa" w:w="60"/>
+              <w:left w:type="dxa" w:w="110"/>
+              <w:bottom w:type="dxa" w:w="60"/>
+              <w:right w:type="dxa" w:w="110"/>
+            </w:tcMar>
+          </w:tcPr>
+          <w:p>
+            <w:pPr>
+              <w:spacing w:after="60" w:before="60"/>
+            </w:pPr>
+            <w:r>
+              <w:rPr>
+                <w:b/>
+                <w:bCs/>
+                <w:sz w:val="22"/>
+                <w:szCs w:val="22"/>
+              </w:rPr>
+              <w:t xml:space="preserve">M – 26</w:t>
+            </w:r>
+          </w:p>
+        </w:tc>
+        <w:tc>
+          <w:tcPr>
+            <w:tcW w:type="dxa" w:w="5400"/>
+            <w:tcMar>
+              <w:top w:type="dxa" w:w="60"/>
+              <w:left w:type="dxa" w:w="110"/>
+              <w:bottom w:type="dxa" w:w="60"/>
+              <w:right w:type="dxa" w:w="110"/>
+            </w:tcMar>
+          </w:tcPr>
+          <w:p>
+            <w:pPr>
+              <w:spacing w:after="90"/>
+            </w:pPr>
+            <w:r>
+              <w:rPr>
+                <w:sz w:val="22"/>
+                <w:szCs w:val="22"/>
+              </w:rPr>
+              <w:t xml:space="preserve"> </w:t>
+            </w:r>
+          </w:p>
+        </w:tc>
+        <w:tc>
+          <w:tcPr>
+            <w:tcW w:type="dxa" w:w="3200"/>
+            <w:tcMar>
+              <w:top w:type="dxa" w:w="60"/>
+              <w:left w:type="dxa" w:w="110"/>
+              <w:bottom w:type="dxa" w:w="60"/>
+              <w:right w:type="dxa" w:w="110"/>
+            </w:tcMar>
+          </w:tcPr>
+          <w:p>
+            <w:pPr>
+              <w:spacing w:after="90"/>
+            </w:pPr>
+            <w:r>
+              <w:rPr>
+                <w:sz w:val="22"/>
+                <w:szCs w:val="22"/>
+              </w:rPr>
+              <w:t xml:space="preserve"> </w:t>
+            </w:r>
+          </w:p>
+        </w:tc>
+      </w:tr>
+      <w:tr>
+        <w:tc>
+          <w:tcPr>
+            <w:tcW w:type="dxa" w:w="1600"/>
+            <w:tcMar>
+              <w:top w:type="dxa" w:w="60"/>
+              <w:left w:type="dxa" w:w="110"/>
+              <w:bottom w:type="dxa" w:w="60"/>
+              <w:right w:type="dxa" w:w="110"/>
+            </w:tcMar>
+          </w:tcPr>
+          <w:p>
+            <w:pPr>
+              <w:spacing w:after="60" w:before="60"/>
+            </w:pPr>
+            <w:r>
+              <w:rPr>
+                <w:b/>
+                <w:bCs/>
+                <w:sz w:val="22"/>
+                <w:szCs w:val="22"/>
+              </w:rPr>
+              <w:t xml:space="preserve">M – 27</w:t>
+            </w:r>
+          </w:p>
+        </w:tc>
+        <w:tc>
+          <w:tcPr>
+            <w:tcW w:type="dxa" w:w="5400"/>
+            <w:tcMar>
+              <w:top w:type="dxa" w:w="60"/>
+              <w:left w:type="dxa" w:w="110"/>
+              <w:bottom w:type="dxa" w:w="60"/>
+              <w:right w:type="dxa" w:w="110"/>
+            </w:tcMar>
+          </w:tcPr>
+          <w:p>
+            <w:pPr>
+              <w:spacing w:after="90"/>
+            </w:pPr>
+            <w:r>
+              <w:rPr>
+                <w:sz w:val="22"/>
+                <w:szCs w:val="22"/>
+              </w:rPr>
+              <w:t xml:space="preserve"> </w:t>
+            </w:r>
+          </w:p>
+        </w:tc>
+        <w:tc>
+          <w:tcPr>
+            <w:tcW w:type="dxa" w:w="3200"/>
+            <w:tcMar>
+              <w:top w:type="dxa" w:w="60"/>
+              <w:left w:type="dxa" w:w="110"/>
+              <w:bottom w:type="dxa" w:w="60"/>
+              <w:right w:type="dxa" w:w="110"/>
+            </w:tcMar>
+          </w:tcPr>
+          <w:p>
+            <w:pPr>
+              <w:spacing w:after="90"/>
+            </w:pPr>
+            <w:r>
+              <w:rPr>
+                <w:sz w:val="22"/>
+                <w:szCs w:val="22"/>
+              </w:rPr>
+              <w:t xml:space="preserve"> </w:t>
+            </w:r>
+          </w:p>
+        </w:tc>
+      </w:tr>
+      <w:tr>
+        <w:tc>
+          <w:tcPr>
+            <w:tcW w:type="dxa" w:w="1600"/>
+            <w:tcMar>
+              <w:top w:type="dxa" w:w="60"/>
+              <w:left w:type="dxa" w:w="110"/>
+              <w:bottom w:type="dxa" w:w="60"/>
+              <w:right w:type="dxa" w:w="110"/>
+            </w:tcMar>
+          </w:tcPr>
+          <w:p>
+            <w:pPr>
+              <w:spacing w:after="60" w:before="60"/>
+            </w:pPr>
+            <w:r>
+              <w:rPr>
+                <w:b/>
+                <w:bCs/>
+                <w:sz w:val="22"/>
+                <w:szCs w:val="22"/>
+              </w:rPr>
+              <w:t xml:space="preserve">M – 28</w:t>
+            </w:r>
+          </w:p>
+        </w:tc>
+        <w:tc>
+          <w:tcPr>
+            <w:tcW w:type="dxa" w:w="5400"/>
+            <w:tcMar>
+              <w:top w:type="dxa" w:w="60"/>
+              <w:left w:type="dxa" w:w="110"/>
+              <w:bottom w:type="dxa" w:w="60"/>
+              <w:right w:type="dxa" w:w="110"/>
+            </w:tcMar>
+          </w:tcPr>
+          <w:p>
+            <w:pPr>
+              <w:spacing w:after="90"/>
+            </w:pPr>
+            <w:r>
+              <w:rPr>
+                <w:sz w:val="22"/>
+                <w:szCs w:val="22"/>
+              </w:rPr>
+              <w:t xml:space="preserve"> </w:t>
+            </w:r>
+          </w:p>
+        </w:tc>
+        <w:tc>
+          <w:tcPr>
+            <w:tcW w:type="dxa" w:w="3200"/>
+            <w:tcMar>
+              <w:top w:type="dxa" w:w="60"/>
+              <w:left w:type="dxa" w:w="110"/>
+              <w:bottom w:type="dxa" w:w="60"/>
+              <w:right w:type="dxa" w:w="110"/>
+            </w:tcMar>
+          </w:tcPr>
+          <w:p>
+            <w:pPr>
+              <w:spacing w:after="90"/>
+            </w:pPr>
+            <w:r>
+              <w:rPr>
+                <w:sz w:val="22"/>
+                <w:szCs w:val="22"/>
+              </w:rPr>
+              <w:t xml:space="preserve"> </w:t>
+            </w:r>
+          </w:p>
+        </w:tc>
+      </w:tr>
+      <w:tr>
+        <w:tc>
+          <w:tcPr>
+            <w:tcW w:type="dxa" w:w="1600"/>
+            <w:tcMar>
+              <w:top w:type="dxa" w:w="60"/>
+              <w:left w:type="dxa" w:w="110"/>
+              <w:bottom w:type="dxa" w:w="60"/>
+              <w:right w:type="dxa" w:w="110"/>
+            </w:tcMar>
+          </w:tcPr>
+          <w:p>
+            <w:pPr>
+              <w:spacing w:after="60" w:before="60"/>
+            </w:pPr>
+            <w:r>
+              <w:rPr>
+                <w:b/>
+                <w:bCs/>
+                <w:sz w:val="22"/>
+                <w:szCs w:val="22"/>
+              </w:rPr>
+              <w:t xml:space="preserve">M – 29</w:t>
+            </w:r>
+          </w:p>
+        </w:tc>
+        <w:tc>
+          <w:tcPr>
+            <w:tcW w:type="dxa" w:w="5400"/>
+            <w:tcMar>
+              <w:top w:type="dxa" w:w="60"/>
+              <w:left w:type="dxa" w:w="110"/>
+              <w:bottom w:type="dxa" w:w="60"/>
+              <w:right w:type="dxa" w:w="110"/>
+            </w:tcMar>
+          </w:tcPr>
+          <w:p>
+            <w:pPr>
+              <w:spacing w:after="90"/>
+            </w:pPr>
+            <w:r>
+              <w:rPr>
+                <w:sz w:val="22"/>
+                <w:szCs w:val="22"/>
+              </w:rPr>
+              <w:t xml:space="preserve"> </w:t>
+            </w:r>
+          </w:p>
+        </w:tc>
+        <w:tc>
+          <w:tcPr>
+            <w:tcW w:type="dxa" w:w="3200"/>
+            <w:tcMar>
+              <w:top w:type="dxa" w:w="60"/>
+              <w:left w:type="dxa" w:w="110"/>
+              <w:bottom w:type="dxa" w:w="60"/>
+              <w:right w:type="dxa" w:w="110"/>
+            </w:tcMar>
+          </w:tcPr>
+          <w:p>
+            <w:pPr>
+              <w:spacing w:after="90"/>
+            </w:pPr>
+            <w:r>
+              <w:rPr>
+                <w:sz w:val="22"/>
+                <w:szCs w:val="22"/>
+              </w:rPr>
+              <w:t xml:space="preserve"> </w:t>
+            </w:r>
+          </w:p>
+        </w:tc>
+      </w:tr>
+      <w:tr>
+        <w:tc>
+          <w:tcPr>
+            <w:tcW w:type="dxa" w:w="1600"/>
+            <w:tcMar>
+              <w:top w:type="dxa" w:w="60"/>
+              <w:left w:type="dxa" w:w="110"/>
+              <w:bottom w:type="dxa" w:w="60"/>
+              <w:right w:type="dxa" w:w="110"/>
+            </w:tcMar>
+          </w:tcPr>
+          <w:p>
+            <w:pPr>
+              <w:spacing w:after="60" w:before="60"/>
+            </w:pPr>
+            <w:r>
+              <w:rPr>
+                <w:b/>
+                <w:bCs/>
+                <w:sz w:val="22"/>
+                <w:szCs w:val="22"/>
+              </w:rPr>
+              <w:t xml:space="preserve">M – 30</w:t>
+            </w:r>
+          </w:p>
+        </w:tc>
+        <w:tc>
+          <w:tcPr>
+            <w:tcW w:type="dxa" w:w="5400"/>
+            <w:tcMar>
+              <w:top w:type="dxa" w:w="60"/>
+              <w:left w:type="dxa" w:w="110"/>
+              <w:bottom w:type="dxa" w:w="60"/>
+              <w:right w:type="dxa" w:w="110"/>
+            </w:tcMar>
+          </w:tcPr>
+          <w:p>
+            <w:pPr>
+              <w:spacing w:after="90"/>
+            </w:pPr>
+            <w:r>
+              <w:rPr>
+                <w:sz w:val="22"/>
+                <w:szCs w:val="22"/>
+              </w:rPr>
+              <w:t xml:space="preserve"> </w:t>
+            </w:r>
+          </w:p>
+        </w:tc>
+        <w:tc>
+          <w:tcPr>
+            <w:tcW w:type="dxa" w:w="3200"/>
+            <w:tcMar>
+              <w:top w:type="dxa" w:w="60"/>
+              <w:left w:type="dxa" w:w="110"/>
+              <w:bottom w:type="dxa" w:w="60"/>
+              <w:right w:type="dxa" w:w="110"/>
+            </w:tcMar>
+          </w:tcPr>
+          <w:p>
+            <w:pPr>
+              <w:spacing w:after="90"/>
+            </w:pPr>
+            <w:r>
+              <w:rPr>
+                <w:sz w:val="22"/>
+                <w:szCs w:val="22"/>
+              </w:rPr>
+              <w:t xml:space="preserve"> </w:t>
+            </w:r>
+          </w:p>
+        </w:tc>
+      </w:tr>
+      <w:tr>
+        <w:tc>
+          <w:tcPr>
+            <w:tcW w:type="dxa" w:w="1600"/>
+            <w:tcMar>
+              <w:top w:type="dxa" w:w="60"/>
+              <w:left w:type="dxa" w:w="110"/>
+              <w:bottom w:type="dxa" w:w="60"/>
+              <w:right w:type="dxa" w:w="110"/>
+            </w:tcMar>
+          </w:tcPr>
+          <w:p>
+            <w:pPr>
+              <w:spacing w:after="60" w:before="60"/>
+            </w:pPr>
+            <w:r>
+              <w:rPr>
+                <w:b/>
+                <w:bCs/>
+                <w:sz w:val="22"/>
+                <w:szCs w:val="22"/>
+              </w:rPr>
+              <w:t xml:space="preserve">M – 31</w:t>
+            </w:r>
+          </w:p>
+        </w:tc>
+        <w:tc>
+          <w:tcPr>
+            <w:tcW w:type="dxa" w:w="5400"/>
+            <w:tcMar>
+              <w:top w:type="dxa" w:w="60"/>
+              <w:left w:type="dxa" w:w="110"/>
+              <w:bottom w:type="dxa" w:w="60"/>
+              <w:right w:type="dxa" w:w="110"/>
+            </w:tcMar>
+          </w:tcPr>
+          <w:p>
+            <w:pPr>
+              <w:spacing w:after="90"/>
+            </w:pPr>
+            <w:r>
+              <w:rPr>
+                <w:sz w:val="22"/>
+                <w:szCs w:val="22"/>
+              </w:rPr>
+              <w:t xml:space="preserve"> </w:t>
+            </w:r>
+          </w:p>
+        </w:tc>
+        <w:tc>
+          <w:tcPr>
+            <w:tcW w:type="dxa" w:w="3200"/>
+            <w:tcMar>
+              <w:top w:type="dxa" w:w="60"/>
+              <w:left w:type="dxa" w:w="110"/>
+              <w:bottom w:type="dxa" w:w="60"/>
+              <w:right w:type="dxa" w:w="110"/>
+            </w:tcMar>
+          </w:tcPr>
+          <w:p>
+            <w:pPr>
+              <w:spacing w:after="90"/>
+            </w:pPr>
+            <w:r>
+              <w:rPr>
+                <w:sz w:val="22"/>
+                <w:szCs w:val="22"/>
+              </w:rPr>
+              <w:t xml:space="preserve"> </w:t>
+            </w:r>
+          </w:p>
+        </w:tc>
+      </w:tr>
+      <w:tr>
+        <w:tc>
+          <w:tcPr>
+            <w:tcW w:type="dxa" w:w="1600"/>
+            <w:tcMar>
+              <w:top w:type="dxa" w:w="60"/>
+              <w:left w:type="dxa" w:w="110"/>
+              <w:bottom w:type="dxa" w:w="60"/>
+              <w:right w:type="dxa" w:w="110"/>
+            </w:tcMar>
+          </w:tcPr>
+          <w:p>
+            <w:pPr>
+              <w:spacing w:after="60" w:before="60"/>
+            </w:pPr>
+            <w:r>
+              <w:rPr>
+                <w:b/>
+                <w:bCs/>
+                <w:sz w:val="22"/>
+                <w:szCs w:val="22"/>
+              </w:rPr>
+              <w:t xml:space="preserve">M – 32</w:t>
+            </w:r>
+          </w:p>
+        </w:tc>
+        <w:tc>
+          <w:tcPr>
+            <w:tcW w:type="dxa" w:w="5400"/>
+            <w:tcMar>
+              <w:top w:type="dxa" w:w="60"/>
+              <w:left w:type="dxa" w:w="110"/>
+              <w:bottom w:type="dxa" w:w="60"/>
+              <w:right w:type="dxa" w:w="110"/>
+            </w:tcMar>
+          </w:tcPr>
+          <w:p>
+            <w:pPr>
+              <w:spacing w:after="90"/>
+            </w:pPr>
+            <w:r>
+              <w:rPr>
+                <w:sz w:val="22"/>
+                <w:szCs w:val="22"/>
+              </w:rPr>
+              <w:t xml:space="preserve"> </w:t>
+            </w:r>
+          </w:p>
+        </w:tc>
+        <w:tc>
+          <w:tcPr>
+            <w:tcW w:type="dxa" w:w="3200"/>
+            <w:tcMar>
+              <w:top w:type="dxa" w:w="60"/>
+              <w:left w:type="dxa" w:w="110"/>
+              <w:bottom w:type="dxa" w:w="60"/>
+              <w:right w:type="dxa" w:w="110"/>
+            </w:tcMar>
+          </w:tcPr>
+          <w:p>
+            <w:pPr>
+              <w:spacing w:after="90"/>
+            </w:pPr>
+            <w:r>
+              <w:rPr>
+                <w:sz w:val="22"/>
+                <w:szCs w:val="22"/>
+              </w:rPr>
+              <w:t xml:space="preserve"> </w:t>
+            </w:r>
+          </w:p>
+        </w:tc>
+      </w:tr>
+      <w:tr>
+        <w:tc>
+          <w:tcPr>
+            <w:tcW w:type="dxa" w:w="1600"/>
+            <w:tcMar>
+              <w:top w:type="dxa" w:w="60"/>
+              <w:left w:type="dxa" w:w="110"/>
+              <w:bottom w:type="dxa" w:w="60"/>
+              <w:right w:type="dxa" w:w="110"/>
+            </w:tcMar>
+          </w:tcPr>
+          <w:p>
+            <w:pPr>
+              <w:spacing w:after="60" w:before="60"/>
+            </w:pPr>
+            <w:r>
+              <w:rPr>
+                <w:b/>
+                <w:bCs/>
+                <w:sz w:val="22"/>
+                <w:szCs w:val="22"/>
+              </w:rPr>
+              <w:t xml:space="preserve">M – 33</w:t>
             </w:r>
           </w:p>
         </w:tc>

</xml_diff>